<commit_message>
sale formulario de envio de pedido 22-09-2025
</commit_message>
<xml_diff>
--- a/sale/https.docx
+++ b/sale/https.docx
@@ -10,49 +10,16 @@
           <w:lang w:val="es-ES"/>
         </w:rPr>
       </w:pPr>
-      <w:r>
-        <w:rPr>
-          <w:b/>
-          <w:bCs/>
-        </w:rPr>
-        <w:fldChar w:fldCharType="begin"/>
-      </w:r>
-      <w:r>
-        <w:rPr>
-          <w:b/>
-          <w:bCs/>
-        </w:rPr>
-        <w:instrText>HYPERLINK "vscode-file://vscode-app/c:/Users/delfi/AppData/Local/Programs/Microsoft%20VS%20Code/resources/app/out/vs/code/electron-browser/workbench/workbench.html" \o ""</w:instrText>
-      </w:r>
-      <w:r>
-        <w:rPr>
-          <w:b/>
-          <w:bCs/>
-        </w:rPr>
-      </w:r>
-      <w:r>
-        <w:rPr>
-          <w:b/>
-          <w:bCs/>
-        </w:rPr>
-        <w:fldChar w:fldCharType="separate"/>
-      </w:r>
-      <w:r>
-        <w:rPr>
-          <w:rStyle w:val="Hipervnculo"/>
-          <w:b/>
-          <w:bCs/>
-        </w:rPr>
-        <w:t>https://myaccount.google.com/apppasswords</w:t>
-      </w:r>
-      <w:r>
-        <w:rPr>
-          <w:b/>
-          <w:bCs/>
-          <w:lang w:val="es-ES"/>
-        </w:rPr>
-        <w:fldChar w:fldCharType="end"/>
-      </w:r>
+      <w:hyperlink r:id="rId4" w:history="1">
+        <w:r>
+          <w:rPr>
+            <w:rStyle w:val="Hipervnculo"/>
+            <w:b/>
+            <w:bCs/>
+          </w:rPr>
+          <w:t>https://myaccount.google.com/apppasswords</w:t>
+        </w:r>
+      </w:hyperlink>
     </w:p>
     <w:p>
       <w:pPr>
@@ -88,78 +55,210 @@
           <w:lang w:val="es-ES"/>
         </w:rPr>
       </w:pPr>
-      <w:proofErr w:type="spellStart"/>
       <w:r>
         <w:rPr>
           <w:b/>
           <w:bCs/>
           <w:lang w:val="es-ES"/>
         </w:rPr>
-        <w:t>brqd</w:t>
+        <w:t xml:space="preserve">brqd lpsb qlrn wmko </w:t>
       </w:r>
-      <w:proofErr w:type="spellEnd"/>
+    </w:p>
+    <w:p>
+      <w:pPr>
+        <w:rPr>
+          <w:b/>
+          <w:bCs/>
+          <w:lang w:val="es-ES"/>
+        </w:rPr>
+      </w:pPr>
       <w:r>
         <w:rPr>
           <w:b/>
           <w:bCs/>
           <w:lang w:val="es-ES"/>
         </w:rPr>
-        <w:t xml:space="preserve"> </w:t>
+        <w:drawing>
+          <wp:inline distT="0" distB="0" distL="0" distR="0" wp14:anchorId="39712F6F" wp14:editId="29DE1D79">
+            <wp:extent cx="5400040" cy="2495550"/>
+            <wp:effectExtent l="0" t="0" r="0" b="0"/>
+            <wp:docPr id="2106213412" name="Imagen 1"/>
+            <wp:cNvGraphicFramePr>
+              <a:graphicFrameLocks xmlns:a="http://schemas.openxmlformats.org/drawingml/2006/main" noChangeAspect="1"/>
+            </wp:cNvGraphicFramePr>
+            <a:graphic xmlns:a="http://schemas.openxmlformats.org/drawingml/2006/main">
+              <a:graphicData uri="http://schemas.openxmlformats.org/drawingml/2006/picture">
+                <pic:pic xmlns:pic="http://schemas.openxmlformats.org/drawingml/2006/picture">
+                  <pic:nvPicPr>
+                    <pic:cNvPr id="2106213412" name=""/>
+                    <pic:cNvPicPr/>
+                  </pic:nvPicPr>
+                  <pic:blipFill>
+                    <a:blip r:embed="rId5"/>
+                    <a:stretch>
+                      <a:fillRect/>
+                    </a:stretch>
+                  </pic:blipFill>
+                  <pic:spPr>
+                    <a:xfrm>
+                      <a:off x="0" y="0"/>
+                      <a:ext cx="5400040" cy="2495550"/>
+                    </a:xfrm>
+                    <a:prstGeom prst="rect">
+                      <a:avLst/>
+                    </a:prstGeom>
+                  </pic:spPr>
+                </pic:pic>
+              </a:graphicData>
+            </a:graphic>
+          </wp:inline>
+        </w:drawing>
       </w:r>
-      <w:proofErr w:type="spellStart"/>
+    </w:p>
+    <w:p>
+      <w:pPr>
+        <w:rPr>
+          <w:b/>
+          <w:bCs/>
+          <w:lang w:val="es-ES"/>
+        </w:rPr>
+      </w:pPr>
       <w:r>
         <w:rPr>
           <w:b/>
           <w:bCs/>
           <w:lang w:val="es-ES"/>
         </w:rPr>
-        <w:t>lpsb</w:t>
+        <w:lastRenderedPageBreak/>
+        <w:drawing>
+          <wp:inline distT="0" distB="0" distL="0" distR="0" wp14:anchorId="7CF6D2F3" wp14:editId="167B0665">
+            <wp:extent cx="5400040" cy="2695575"/>
+            <wp:effectExtent l="0" t="0" r="0" b="9525"/>
+            <wp:docPr id="2114038046" name="Imagen 1"/>
+            <wp:cNvGraphicFramePr>
+              <a:graphicFrameLocks xmlns:a="http://schemas.openxmlformats.org/drawingml/2006/main" noChangeAspect="1"/>
+            </wp:cNvGraphicFramePr>
+            <a:graphic xmlns:a="http://schemas.openxmlformats.org/drawingml/2006/main">
+              <a:graphicData uri="http://schemas.openxmlformats.org/drawingml/2006/picture">
+                <pic:pic xmlns:pic="http://schemas.openxmlformats.org/drawingml/2006/picture">
+                  <pic:nvPicPr>
+                    <pic:cNvPr id="2114038046" name=""/>
+                    <pic:cNvPicPr/>
+                  </pic:nvPicPr>
+                  <pic:blipFill>
+                    <a:blip r:embed="rId6"/>
+                    <a:stretch>
+                      <a:fillRect/>
+                    </a:stretch>
+                  </pic:blipFill>
+                  <pic:spPr>
+                    <a:xfrm>
+                      <a:off x="0" y="0"/>
+                      <a:ext cx="5400040" cy="2695575"/>
+                    </a:xfrm>
+                    <a:prstGeom prst="rect">
+                      <a:avLst/>
+                    </a:prstGeom>
+                  </pic:spPr>
+                </pic:pic>
+              </a:graphicData>
+            </a:graphic>
+          </wp:inline>
+        </w:drawing>
       </w:r>
-      <w:proofErr w:type="spellEnd"/>
       <w:r>
         <w:rPr>
           <w:b/>
           <w:bCs/>
           <w:lang w:val="es-ES"/>
         </w:rPr>
-        <w:t xml:space="preserve"> </w:t>
+        <w:drawing>
+          <wp:inline distT="0" distB="0" distL="0" distR="0" wp14:anchorId="3F2ACE75" wp14:editId="03D55C12">
+            <wp:extent cx="5400040" cy="2667635"/>
+            <wp:effectExtent l="0" t="0" r="0" b="0"/>
+            <wp:docPr id="87582416" name="Imagen 1"/>
+            <wp:cNvGraphicFramePr>
+              <a:graphicFrameLocks xmlns:a="http://schemas.openxmlformats.org/drawingml/2006/main" noChangeAspect="1"/>
+            </wp:cNvGraphicFramePr>
+            <a:graphic xmlns:a="http://schemas.openxmlformats.org/drawingml/2006/main">
+              <a:graphicData uri="http://schemas.openxmlformats.org/drawingml/2006/picture">
+                <pic:pic xmlns:pic="http://schemas.openxmlformats.org/drawingml/2006/picture">
+                  <pic:nvPicPr>
+                    <pic:cNvPr id="87582416" name=""/>
+                    <pic:cNvPicPr/>
+                  </pic:nvPicPr>
+                  <pic:blipFill>
+                    <a:blip r:embed="rId7"/>
+                    <a:stretch>
+                      <a:fillRect/>
+                    </a:stretch>
+                  </pic:blipFill>
+                  <pic:spPr>
+                    <a:xfrm>
+                      <a:off x="0" y="0"/>
+                      <a:ext cx="5400040" cy="2667635"/>
+                    </a:xfrm>
+                    <a:prstGeom prst="rect">
+                      <a:avLst/>
+                    </a:prstGeom>
+                  </pic:spPr>
+                </pic:pic>
+              </a:graphicData>
+            </a:graphic>
+          </wp:inline>
+        </w:drawing>
       </w:r>
-      <w:proofErr w:type="spellStart"/>
       <w:r>
         <w:rPr>
           <w:b/>
           <w:bCs/>
           <w:lang w:val="es-ES"/>
         </w:rPr>
-        <w:t>qlrn</w:t>
+        <w:drawing>
+          <wp:inline distT="0" distB="0" distL="0" distR="0" wp14:anchorId="25DD355C" wp14:editId="542A240A">
+            <wp:extent cx="5400040" cy="3035935"/>
+            <wp:effectExtent l="0" t="0" r="0" b="0"/>
+            <wp:docPr id="1005399304" name="Imagen 1"/>
+            <wp:cNvGraphicFramePr>
+              <a:graphicFrameLocks xmlns:a="http://schemas.openxmlformats.org/drawingml/2006/main" noChangeAspect="1"/>
+            </wp:cNvGraphicFramePr>
+            <a:graphic xmlns:a="http://schemas.openxmlformats.org/drawingml/2006/main">
+              <a:graphicData uri="http://schemas.openxmlformats.org/drawingml/2006/picture">
+                <pic:pic xmlns:pic="http://schemas.openxmlformats.org/drawingml/2006/picture">
+                  <pic:nvPicPr>
+                    <pic:cNvPr id="1005399304" name=""/>
+                    <pic:cNvPicPr/>
+                  </pic:nvPicPr>
+                  <pic:blipFill>
+                    <a:blip r:embed="rId8"/>
+                    <a:stretch>
+                      <a:fillRect/>
+                    </a:stretch>
+                  </pic:blipFill>
+                  <pic:spPr>
+                    <a:xfrm>
+                      <a:off x="0" y="0"/>
+                      <a:ext cx="5400040" cy="3035935"/>
+                    </a:xfrm>
+                    <a:prstGeom prst="rect">
+                      <a:avLst/>
+                    </a:prstGeom>
+                  </pic:spPr>
+                </pic:pic>
+              </a:graphicData>
+            </a:graphic>
+          </wp:inline>
+        </w:drawing>
       </w:r>
-      <w:proofErr w:type="spellEnd"/>
-      <w:r>
+    </w:p>
+    <w:p>
+      <w:pPr>
         <w:rPr>
           <w:b/>
           <w:bCs/>
           <w:lang w:val="es-ES"/>
         </w:rPr>
-        <w:t xml:space="preserve"> </w:t>
-      </w:r>
-      <w:proofErr w:type="spellStart"/>
-      <w:r>
-        <w:rPr>
-          <w:b/>
-          <w:bCs/>
-          <w:lang w:val="es-ES"/>
-        </w:rPr>
-        <w:t>wmko</w:t>
-      </w:r>
-      <w:proofErr w:type="spellEnd"/>
-      <w:r>
-        <w:rPr>
-          <w:b/>
-          <w:bCs/>
-          <w:lang w:val="es-ES"/>
-        </w:rPr>
-        <w:t xml:space="preserve"> </w:t>
-      </w:r>
+      </w:pPr>
     </w:p>
     <w:p/>
     <w:sectPr>
@@ -777,6 +876,7 @@
   <w:style w:type="character" w:default="1" w:styleId="Fuentedeprrafopredeter">
     <w:name w:val="Default Paragraph Font"/>
     <w:uiPriority w:val="1"/>
+    <w:semiHidden/>
     <w:unhideWhenUsed/>
   </w:style>
   <w:style w:type="table" w:default="1" w:styleId="Tablanormal">

</xml_diff>

<commit_message>
sale formulario de envio de pedido 23-09-2025
</commit_message>
<xml_diff>
--- a/sale/https.docx
+++ b/sale/https.docx
@@ -19,6 +19,9 @@
     </w:p>
     <w:p>
       <w:r>
+        <w:rPr>
+          <w:noProof/>
+        </w:rPr>
         <w:drawing>
           <wp:inline distT="0" distB="0" distL="0" distR="0" wp14:anchorId="14F63539" wp14:editId="79E6B112">
             <wp:extent cx="5400040" cy="3035935"/>
@@ -127,15 +130,6 @@
         </w:rPr>
         <w:t>esto lo configuro con el correo hostingdelfin.alber@gmail.com</w:t>
       </w:r>
-    </w:p>
-    <w:p>
-      <w:pPr>
-        <w:rPr>
-          <w:b/>
-          <w:bCs/>
-          <w:lang w:val="es-ES"/>
-        </w:rPr>
-      </w:pPr>
     </w:p>
     <w:p>
       <w:pPr>

</xml_diff>

<commit_message>
sale formulario de envio de pedido 24-09-2025
</commit_message>
<xml_diff>
--- a/sale/https.docx
+++ b/sale/https.docx
@@ -128,8 +128,19 @@
           <w:bCs/>
           <w:lang w:val="es-ES"/>
         </w:rPr>
-        <w:t>esto lo configuro con el correo hostingdelfin.alber@gmail.com</w:t>
+        <w:t xml:space="preserve">esto lo configuro con el correo </w:t>
       </w:r>
+      <w:hyperlink r:id="rId8" w:history="1">
+        <w:r>
+          <w:rPr>
+            <w:rStyle w:val="Hipervnculo"/>
+            <w:b/>
+            <w:bCs/>
+            <w:lang w:val="es-ES"/>
+          </w:rPr>
+          <w:t>hostingdelfin.alber@gmail.com</w:t>
+        </w:r>
+      </w:hyperlink>
     </w:p>
     <w:p>
       <w:pPr>
@@ -243,7 +254,7 @@
                     <pic:cNvPicPr/>
                   </pic:nvPicPr>
                   <pic:blipFill>
-                    <a:blip r:embed="rId8"/>
+                    <a:blip r:embed="rId9"/>
                     <a:stretch>
                       <a:fillRect/>
                     </a:stretch>
@@ -296,7 +307,7 @@
                     <pic:cNvPicPr/>
                   </pic:nvPicPr>
                   <pic:blipFill>
-                    <a:blip r:embed="rId9"/>
+                    <a:blip r:embed="rId10"/>
                     <a:stretch>
                       <a:fillRect/>
                     </a:stretch>
@@ -339,7 +350,7 @@
                     <pic:cNvPicPr/>
                   </pic:nvPicPr>
                   <pic:blipFill>
-                    <a:blip r:embed="rId10"/>
+                    <a:blip r:embed="rId11"/>
                     <a:stretch>
                       <a:fillRect/>
                     </a:stretch>
@@ -382,7 +393,7 @@
                     <pic:cNvPicPr/>
                   </pic:nvPicPr>
                   <pic:blipFill>
-                    <a:blip r:embed="rId11"/>
+                    <a:blip r:embed="rId12"/>
                     <a:stretch>
                       <a:fillRect/>
                     </a:stretch>
@@ -1376,6 +1387,18 @@
       <w:shd w:val="clear" w:color="auto" w:fill="E1DFDD"/>
     </w:rPr>
   </w:style>
+  <w:style w:type="character" w:styleId="Hipervnculovisitado">
+    <w:name w:val="FollowedHyperlink"/>
+    <w:basedOn w:val="Fuentedeprrafopredeter"/>
+    <w:uiPriority w:val="99"/>
+    <w:semiHidden/>
+    <w:unhideWhenUsed/>
+    <w:rsid w:val="00D75701"/>
+    <w:rPr>
+      <w:color w:val="954F72" w:themeColor="followedHyperlink"/>
+      <w:u w:val="single"/>
+    </w:rPr>
+  </w:style>
 </w:styles>
 </file>
 

</xml_diff>